<commit_message>
R2 package v2: fill Ethiopia CAP from PWT, figure script, citation audit
WDI records zero gross capital formation for Ethiopia in 2000-2010; these
values now come from the PWT 11.0 national accounts (same concept, ratio
1.002 where both exist). All analyses rerun; guidance, do-file and data
description updated. Adds figures_R2.R (estimation sample, band defined
as the cross-country range) and a hand-check list of citations.

Co-Authored-By: Claude Opus 5.5 <noreply@anthropic.com>
Claude-Session: https://claude.ai/code/session_01GFxSA2P6Fp99rRotgyyGBz
</commit_message>
<xml_diff>
--- a/revision_R2/docs/R2_data_description.docx
+++ b/revision_R2/docs/R2_data_description.docx
@@ -416,6 +416,77 @@
                 <w:sz w:val="17"/>
                 <w:szCs w:val="17"/>
               </w:rPr>
+              <w:t xml:space="preserve">pwt110_cap_national_prices.csv</w:t>
+            </w:r>
+          </w:p>
+        </w:tc>
+        <w:tc>
+          <w:tcPr>
+            <w:tcW w:type="dxa" w:w="3800"/>
+            <w:tcMar>
+              <w:top w:type="dxa" w:w="40"/>
+              <w:left w:type="dxa" w:w="80"/>
+              <w:bottom w:type="dxa" w:w="40"/>
+              <w:right w:type="dxa" w:w="80"/>
+            </w:tcMar>
+          </w:tcPr>
+          <w:p>
+            <w:r>
+              <w:rPr>
+                <w:b w:val="false"/>
+                <w:bCs w:val="false"/>
+                <w:sz w:val="17"/>
+                <w:szCs w:val="17"/>
+              </w:rPr>
+              <w:t xml:space="preserve">Gross capital formation share of GDP at current national prices, PWT 11.0, 1990–2023</w:t>
+            </w:r>
+          </w:p>
+        </w:tc>
+        <w:tc>
+          <w:tcPr>
+            <w:tcW w:type="dxa" w:w="2860"/>
+            <w:tcMar>
+              <w:top w:type="dxa" w:w="40"/>
+              <w:left w:type="dxa" w:w="80"/>
+              <w:bottom w:type="dxa" w:w="40"/>
+              <w:right w:type="dxa" w:w="80"/>
+            </w:tcMar>
+          </w:tcPr>
+          <w:p>
+            <w:r>
+              <w:rPr>
+                <w:b w:val="false"/>
+                <w:bCs w:val="false"/>
+                <w:sz w:val="17"/>
+                <w:szCs w:val="17"/>
+              </w:rPr>
+              <w:t xml:space="preserve">Block [R2-17] CAP gap-fill (Ethiopia 2000–2010)</w:t>
+            </w:r>
+          </w:p>
+        </w:tc>
+      </w:tr>
+      <w:tr>
+        <w:trPr>
+          <w:tblHeader w:val="false"/>
+        </w:trPr>
+        <w:tc>
+          <w:tcPr>
+            <w:tcW w:type="dxa" w:w="2700"/>
+            <w:tcMar>
+              <w:top w:type="dxa" w:w="40"/>
+              <w:left w:type="dxa" w:w="80"/>
+              <w:bottom w:type="dxa" w:w="40"/>
+              <w:right w:type="dxa" w:w="80"/>
+            </w:tcMar>
+          </w:tcPr>
+          <w:p>
+            <w:r>
+              <w:rPr>
+                <w:b w:val="false"/>
+                <w:bCs w:val="false"/>
+                <w:sz w:val="17"/>
+                <w:szCs w:val="17"/>
+              </w:rPr>
               <w:t xml:space="preserve">analysis_replica.csv</w:t>
             </w:r>
           </w:p>
@@ -584,6 +655,26 @@
       </w:r>
       <w:r>
         <w:t xml:space="preserve"> (dataflow IMF.RES:CTOT, version 5.0.1, updated 15 June 2026), downloaded on 11 October 2026 through the IMF SDMX 2.1 API. Query: https://api.imf.org/external/sdmx/2.1/data/IMF.RES,CTOT,5.0.1/.CEPI_CTOTX_GDP+CEPI_CTOTX_TX+CEMPI_CTOTXM_GDP.H_FW_IX+H_RW_IX.A (header Accept: application/vnd.sdmx.data+csv). Reference: Gruss and Kebhaj (2019); suggested citation: International Monetary Fund, Commodity Terms of Trade (CTOT), https://data.imf.org/en/datasets/IMF.RES:CTOT.</w:t>
+      </w:r>
+    </w:p>
+    <w:p>
+      <w:pPr>
+        <w:pStyle w:val="ListParagraph"/>
+        <w:numPr>
+          <w:ilvl w:val="0"/>
+          <w:numId w:val="2"/>
+        </w:numPr>
+        <w:spacing w:after="60"/>
+      </w:pPr>
+      <w:r>
+        <w:rPr>
+          <w:b/>
+          <w:bCs/>
+        </w:rPr>
+        <w:t xml:space="preserve">Penn World Table 11.0</w:t>
+      </w:r>
+      <w:r>
+        <w:t xml:space="preserve"> (Feenstra, Inklaar and Timmer, 2015; Groningen Growth and Development Centre, released 10 October 2025), DataverseNL, doi:10.34894/FABVLR. Files pwt110.dta and pwt110_na_data.dta downloaded on 11 October 2026 from https://dataverse.nl/api/access/datafile/554030 and /554024. Licence: CC BY 4.0.</w:t>
       </w:r>
     </w:p>
     <w:p>
@@ -2168,7 +2259,288 @@
         <w:spacing w:after="120" w:before="240"/>
       </w:pPr>
       <w:r>
-        <w:t xml:space="preserve">6. Replication panels and scripts</w:t>
+        <w:t xml:space="preserve">6. pwt110_cap_national_prices.csv</w:t>
+      </w:r>
+    </w:p>
+    <w:p>
+      <w:pPr>
+        <w:spacing w:after="120"/>
+      </w:pPr>
+      <w:r>
+        <w:t xml:space="preserve">Purpose: WDI records gross capital formation (NE.GDI.TOTL.ZS) as 0 for Ethiopia in 2000–2010. The PWT 11.0 national-accounts file reports gross capital formation (v_i) and GDP (v_gdp) at current national prices, so cap_pwt = 100 × v_i / v_gdp is the same concept as the WDI indicator. Check: for Ethiopia in 2011–2023 the WDI/PWT ratio averages 1.002; across all sample countries and years the correlation with WDI is 0.93 (mean absolute difference 1.3 percentage points). The PPP-based PWT share (csh_i) is a different concept (correlation 0.81) and is not used. do_10.6.do replaces only WDI values equal to zero, which affects Ethiopia 2000–2010 (11 observations; filled values 22.2–29.0 percent of GDP).</w:t>
+      </w:r>
+    </w:p>
+    <w:tbl>
+      <w:tblPr>
+        <w:tblW w:type="dxa" w:w="9360"/>
+        <w:tblBorders>
+          <w:top w:val="single" w:color="auto" w:sz="4"/>
+          <w:left w:val="single" w:color="auto" w:sz="4"/>
+          <w:bottom w:val="single" w:color="auto" w:sz="4"/>
+          <w:right w:val="single" w:color="auto" w:sz="4"/>
+          <w:insideH w:val="single" w:color="auto" w:sz="4"/>
+          <w:insideV w:val="single" w:color="auto" w:sz="4"/>
+        </w:tblBorders>
+      </w:tblPr>
+      <w:tblGrid>
+        <w:gridCol w:w="3000"/>
+        <w:gridCol w:w="6360"/>
+      </w:tblGrid>
+      <w:tr>
+        <w:trPr>
+          <w:tblHeader/>
+        </w:trPr>
+        <w:tc>
+          <w:tcPr>
+            <w:tcW w:type="dxa" w:w="3000"/>
+            <w:shd w:fill="D9E2EC" w:color="auto" w:val="clear"/>
+            <w:tcMar>
+              <w:top w:type="dxa" w:w="40"/>
+              <w:left w:type="dxa" w:w="80"/>
+              <w:bottom w:type="dxa" w:w="40"/>
+              <w:right w:type="dxa" w:w="80"/>
+            </w:tcMar>
+          </w:tcPr>
+          <w:p>
+            <w:r>
+              <w:rPr>
+                <w:b/>
+                <w:bCs/>
+                <w:sz w:val="17"/>
+                <w:szCs w:val="17"/>
+              </w:rPr>
+              <w:t xml:space="preserve">Variable</w:t>
+            </w:r>
+          </w:p>
+        </w:tc>
+        <w:tc>
+          <w:tcPr>
+            <w:tcW w:type="dxa" w:w="6360"/>
+            <w:shd w:fill="D9E2EC" w:color="auto" w:val="clear"/>
+            <w:tcMar>
+              <w:top w:type="dxa" w:w="40"/>
+              <w:left w:type="dxa" w:w="80"/>
+              <w:bottom w:type="dxa" w:w="40"/>
+              <w:right w:type="dxa" w:w="80"/>
+            </w:tcMar>
+          </w:tcPr>
+          <w:p>
+            <w:r>
+              <w:rPr>
+                <w:b/>
+                <w:bCs/>
+                <w:sz w:val="17"/>
+                <w:szCs w:val="17"/>
+              </w:rPr>
+              <w:t xml:space="preserve">Definition</w:t>
+            </w:r>
+          </w:p>
+        </w:tc>
+      </w:tr>
+      <w:tr>
+        <w:trPr>
+          <w:tblHeader w:val="false"/>
+        </w:trPr>
+        <w:tc>
+          <w:tcPr>
+            <w:tcW w:type="dxa" w:w="3000"/>
+            <w:tcMar>
+              <w:top w:type="dxa" w:w="40"/>
+              <w:left w:type="dxa" w:w="80"/>
+              <w:bottom w:type="dxa" w:w="40"/>
+              <w:right w:type="dxa" w:w="80"/>
+            </w:tcMar>
+          </w:tcPr>
+          <w:p>
+            <w:r>
+              <w:rPr>
+                <w:b w:val="false"/>
+                <w:bCs w:val="false"/>
+                <w:sz w:val="17"/>
+                <w:szCs w:val="17"/>
+              </w:rPr>
+              <w:t xml:space="preserve">country_3d, country_2d, year</w:t>
+            </w:r>
+          </w:p>
+        </w:tc>
+        <w:tc>
+          <w:tcPr>
+            <w:tcW w:type="dxa" w:w="6360"/>
+            <w:tcMar>
+              <w:top w:type="dxa" w:w="40"/>
+              <w:left w:type="dxa" w:w="80"/>
+              <w:bottom w:type="dxa" w:w="40"/>
+              <w:right w:type="dxa" w:w="80"/>
+            </w:tcMar>
+          </w:tcPr>
+          <w:p>
+            <w:r>
+              <w:rPr>
+                <w:b w:val="false"/>
+                <w:bCs w:val="false"/>
+                <w:sz w:val="17"/>
+                <w:szCs w:val="17"/>
+              </w:rPr>
+              <w:t xml:space="preserve">Country codes (PWT countrycode); year 1990–2023</w:t>
+            </w:r>
+          </w:p>
+        </w:tc>
+      </w:tr>
+      <w:tr>
+        <w:trPr>
+          <w:tblHeader w:val="false"/>
+        </w:trPr>
+        <w:tc>
+          <w:tcPr>
+            <w:tcW w:type="dxa" w:w="3000"/>
+            <w:tcMar>
+              <w:top w:type="dxa" w:w="40"/>
+              <w:left w:type="dxa" w:w="80"/>
+              <w:bottom w:type="dxa" w:w="40"/>
+              <w:right w:type="dxa" w:w="80"/>
+            </w:tcMar>
+          </w:tcPr>
+          <w:p>
+            <w:r>
+              <w:rPr>
+                <w:b w:val="false"/>
+                <w:bCs w:val="false"/>
+                <w:sz w:val="17"/>
+                <w:szCs w:val="17"/>
+              </w:rPr>
+              <w:t xml:space="preserve">v_i</w:t>
+            </w:r>
+          </w:p>
+        </w:tc>
+        <w:tc>
+          <w:tcPr>
+            <w:tcW w:type="dxa" w:w="6360"/>
+            <w:tcMar>
+              <w:top w:type="dxa" w:w="40"/>
+              <w:left w:type="dxa" w:w="80"/>
+              <w:bottom w:type="dxa" w:w="40"/>
+              <w:right w:type="dxa" w:w="80"/>
+            </w:tcMar>
+          </w:tcPr>
+          <w:p>
+            <w:r>
+              <w:rPr>
+                <w:b w:val="false"/>
+                <w:bCs w:val="false"/>
+                <w:sz w:val="17"/>
+                <w:szCs w:val="17"/>
+              </w:rPr>
+              <w:t xml:space="preserve">Gross capital formation at current national prices (PWT 11.0 national accounts)</w:t>
+            </w:r>
+          </w:p>
+        </w:tc>
+      </w:tr>
+      <w:tr>
+        <w:trPr>
+          <w:tblHeader w:val="false"/>
+        </w:trPr>
+        <w:tc>
+          <w:tcPr>
+            <w:tcW w:type="dxa" w:w="3000"/>
+            <w:tcMar>
+              <w:top w:type="dxa" w:w="40"/>
+              <w:left w:type="dxa" w:w="80"/>
+              <w:bottom w:type="dxa" w:w="40"/>
+              <w:right w:type="dxa" w:w="80"/>
+            </w:tcMar>
+          </w:tcPr>
+          <w:p>
+            <w:r>
+              <w:rPr>
+                <w:b w:val="false"/>
+                <w:bCs w:val="false"/>
+                <w:sz w:val="17"/>
+                <w:szCs w:val="17"/>
+              </w:rPr>
+              <w:t xml:space="preserve">v_gdp</w:t>
+            </w:r>
+          </w:p>
+        </w:tc>
+        <w:tc>
+          <w:tcPr>
+            <w:tcW w:type="dxa" w:w="6360"/>
+            <w:tcMar>
+              <w:top w:type="dxa" w:w="40"/>
+              <w:left w:type="dxa" w:w="80"/>
+              <w:bottom w:type="dxa" w:w="40"/>
+              <w:right w:type="dxa" w:w="80"/>
+            </w:tcMar>
+          </w:tcPr>
+          <w:p>
+            <w:r>
+              <w:rPr>
+                <w:b w:val="false"/>
+                <w:bCs w:val="false"/>
+                <w:sz w:val="17"/>
+                <w:szCs w:val="17"/>
+              </w:rPr>
+              <w:t xml:space="preserve">GDP at current national prices</w:t>
+            </w:r>
+          </w:p>
+        </w:tc>
+      </w:tr>
+      <w:tr>
+        <w:trPr>
+          <w:tblHeader w:val="false"/>
+        </w:trPr>
+        <w:tc>
+          <w:tcPr>
+            <w:tcW w:type="dxa" w:w="3000"/>
+            <w:tcMar>
+              <w:top w:type="dxa" w:w="40"/>
+              <w:left w:type="dxa" w:w="80"/>
+              <w:bottom w:type="dxa" w:w="40"/>
+              <w:right w:type="dxa" w:w="80"/>
+            </w:tcMar>
+          </w:tcPr>
+          <w:p>
+            <w:r>
+              <w:rPr>
+                <w:b w:val="false"/>
+                <w:bCs w:val="false"/>
+                <w:sz w:val="17"/>
+                <w:szCs w:val="17"/>
+              </w:rPr>
+              <w:t xml:space="preserve">cap_pwt</w:t>
+            </w:r>
+          </w:p>
+        </w:tc>
+        <w:tc>
+          <w:tcPr>
+            <w:tcW w:type="dxa" w:w="6360"/>
+            <w:tcMar>
+              <w:top w:type="dxa" w:w="40"/>
+              <w:left w:type="dxa" w:w="80"/>
+              <w:bottom w:type="dxa" w:w="40"/>
+              <w:right w:type="dxa" w:w="80"/>
+            </w:tcMar>
+          </w:tcPr>
+          <w:p>
+            <w:r>
+              <w:rPr>
+                <w:b w:val="false"/>
+                <w:bCs w:val="false"/>
+                <w:sz w:val="17"/>
+                <w:szCs w:val="17"/>
+              </w:rPr>
+              <w:t xml:space="preserve">100 × v_i / v_gdp, percent of GDP</w:t>
+            </w:r>
+          </w:p>
+        </w:tc>
+      </w:tr>
+    </w:tbl>
+    <w:p>
+      <w:pPr>
+        <w:pStyle w:val="Heading2"/>
+        <w:spacing w:after="120" w:before="240"/>
+      </w:pPr>
+      <w:r>
+        <w:t xml:space="preserve">7. Replication panels and scripts</w:t>
       </w:r>
     </w:p>
     <w:p>
@@ -2188,7 +2560,7 @@
         <w:t xml:space="preserve">analysis_replica.csv</w:t>
       </w:r>
       <w:r>
-        <w:t xml:space="preserve"> — built by revision_R2/build_analysis.py with the same rules as do_10.5.do: WDI (gdp, cap, urb), PWT 11.0 (hci, pop), World Bank income classes, GFN (ef, bio), the WIPO patent series with the perpetual inventory (δ = 0.15; S_1980 = P_1980/(g0 + δ), g0 = 1980–1985 growth, 5 percent fallback), countries with any missing value dropped, Cyprus and Turkey treated as Europe (as in iso.dta). Result: 43 countries (17 Asian, 26 African), 1,032 observations; lnGDP, lnEF and lnBIO match Table 3 exactly. Extra columns: patstock_abr and lnpat_abr (stock of filings abroad).</w:t>
+        <w:t xml:space="preserve"> — built by revision_R2/build_analysis.py with the same rules as do_10.5.do: WDI (gdp, cap, urb), PWT 11.0 (hci, pop), World Bank income classes, GFN (ef, bio), the WIPO patent series with the perpetual inventory (δ = 0.15; S_1980 = P_1980/(g0 + δ), g0 = 1980–1985 growth, 5 percent fallback), Ethiopia's 2000–2010 CAP filled from cap_pwt (columns cap_wdi and cap_filled keep the original series and the flag), countries with any missing value dropped, Cyprus and Turkey treated as Europe (as in iso.dta). Result: 43 countries (17 Asian, 26 African), 1,032 observations; lnGDP, lnEF and lnBIO match Table 3 exactly. Extra columns: patstock_abr and lnpat_abr (stock of filings abroad).</w:t>
       </w:r>
     </w:p>
     <w:p>
@@ -2225,10 +2597,10 @@
           <w:b/>
           <w:bCs/>
         </w:rPr>
-        <w:t xml:space="preserve">Data check:</w:t>
-      </w:r>
-      <w:r>
-        <w:t xml:space="preserve"> the WDI extract has gross capital formation = 0 for Ethiopia in 2000–2010 (see guidance, Part E1).</w:t>
+        <w:t xml:space="preserve">figures_R2.R</w:t>
+      </w:r>
+      <w:r>
+        <w:t xml:space="preserve"> — the researcher's figure script with tagged changes: the estimation sample (analysis.dta) instead of ready.dta, ggrepel loaded, and captions that define the shaded band as the cross-country range (minimum to maximum). Requires the R package countrycode for country names.</w:t>
       </w:r>
     </w:p>
     <w:p>
@@ -2284,6 +2656,19 @@
       </w:pPr>
       <w:r>
         <w:t xml:space="preserve">Goldsmith-Pinkham P, Sorkin I and Swift H (2020) Bartik instruments: What, when, why, and how. American Economic Review 110(8): 2586–2624.</w:t>
+      </w:r>
+    </w:p>
+    <w:p>
+      <w:pPr>
+        <w:pStyle w:val="ListParagraph"/>
+        <w:numPr>
+          <w:ilvl w:val="0"/>
+          <w:numId w:val="2"/>
+        </w:numPr>
+        <w:spacing w:after="60"/>
+      </w:pPr>
+      <w:r>
+        <w:t xml:space="preserve">Feenstra RC, Inklaar R and Timmer MP (2015) The next generation of the Penn World Table. American Economic Review 105(10): 3150–3182.</w:t>
       </w:r>
     </w:p>
     <w:p>

</xml_diff>